<commit_message>
Checking for pending changes
</commit_message>
<xml_diff>
--- a/src/apps/03050-FirstTrial/FirstTrial.ConsoleUi/FirstTemplate.docx
+++ b/src/apps/03050-FirstTrial/FirstTrial.ConsoleUi/FirstTemplate.docx
@@ -30,41 +30,19 @@
             <w:color w:val="8496B0" w:themeColor="text2" w:themeTint="99"/>
           </w:rPr>
           <w:alias w:val="Field"/>
-          <w:tag w:val="16454088-2562971386"/>
-          <w:id w:val="-1731995910"/>
+          <w:tag w:val="54444047-853157254"/>
+          <w:id w:val="853157254"/>
           <w:placeholder>
-            <w:docPart w:val="CAB76825514442AE8CAD695F4CDBA07F"/>
+            <w:docPart w:val="65D9583859CE414BAFD061FB6AD09BE6"/>
           </w:placeholder>
         </w:sdtPr>
         <w:sdtContent>
           <w:r>
+            <w:rPr>
+              <w:iCs/>
+              <w:color w:val="000000" w:themeColor="text1"/>
+            </w:rPr>
             <w:t>FirstName</w:t>
-          </w:r>
-        </w:sdtContent>
-      </w:sdt>
-      <w:r>
-        <w:rPr>
-          <w:i/>
-          <w:color w:val="8496B0" w:themeColor="text2" w:themeTint="99"/>
-        </w:rPr>
-        <w:t xml:space="preserve"> </w:t>
-      </w:r>
-      <w:sdt>
-        <w:sdtPr>
-          <w:rPr>
-            <w:i/>
-            <w:color w:val="8496B0" w:themeColor="text2" w:themeTint="99"/>
-          </w:rPr>
-          <w:alias w:val="Field"/>
-          <w:tag w:val="16454088-342299060"/>
-          <w:id w:val="342299060"/>
-          <w:placeholder>
-            <w:docPart w:val="11EA66DB2AE54291AEBAEFCEAC8986CF"/>
-          </w:placeholder>
-        </w:sdtPr>
-        <w:sdtContent>
-          <w:r>
-            <w:t>LastName</w:t>
           </w:r>
         </w:sdtContent>
       </w:sdt>
@@ -104,15 +82,19 @@
             <w:color w:val="8496B0" w:themeColor="text2" w:themeTint="99"/>
           </w:rPr>
           <w:alias w:val="Field"/>
-          <w:tag w:val="16454088-1049892066"/>
-          <w:id w:val="1049892066"/>
+          <w:tag w:val="54444047-3640362556"/>
+          <w:id w:val="-654604740"/>
           <w:placeholder>
-            <w:docPart w:val="1DBCA0768CB8473A828D4205C3E18BB4"/>
+            <w:docPart w:val="39EE4219BE044366AF4FDC43DFF79370"/>
           </w:placeholder>
         </w:sdtPr>
         <w:sdtContent>
           <w:r>
-            <w:t>JobTitle</w:t>
+            <w:rPr>
+              <w:iCs/>
+              <w:color w:val="000000" w:themeColor="text1"/>
+            </w:rPr>
+            <w:t>LastName</w:t>
           </w:r>
         </w:sdtContent>
       </w:sdt>
@@ -145,25 +127,6 @@
         </w:rPr>
         <w:tab/>
       </w:r>
-      <w:sdt>
-        <w:sdtPr>
-          <w:rPr>
-            <w:i/>
-            <w:color w:val="8496B0" w:themeColor="text2" w:themeTint="99"/>
-          </w:rPr>
-          <w:alias w:val="Field"/>
-          <w:tag w:val="16454088-941498451"/>
-          <w:id w:val="941498451"/>
-          <w:placeholder>
-            <w:docPart w:val="DE375C397BE346C69177E1021D30C88C"/>
-          </w:placeholder>
-        </w:sdtPr>
-        <w:sdtContent>
-          <w:r>
-            <w:t>Company</w:t>
-          </w:r>
-        </w:sdtContent>
-      </w:sdt>
     </w:p>
     <w:p>
       <w:pPr>
@@ -186,77 +149,66 @@
         </w:rPr>
         <w:tab/>
       </w:r>
-      <w:sdt>
-        <w:sdtPr>
-          <w:rPr>
-            <w:i/>
-            <w:color w:val="8496B0" w:themeColor="text2" w:themeTint="99"/>
-          </w:rPr>
-          <w:alias w:val="Field"/>
-          <w:tag w:val="16454088-2830247393"/>
-          <w:id w:val="-1464719903"/>
-          <w:placeholder>
-            <w:docPart w:val="BB08268CAA024315981A2A27204943BD"/>
-          </w:placeholder>
-        </w:sdtPr>
-        <w:sdtContent>
-          <w:r>
-            <w:t>Address.City</w:t>
-          </w:r>
-        </w:sdtContent>
-      </w:sdt>
+    </w:p>
+    <w:p>
+      <w:pPr>
+        <w:rPr>
+          <w:i/>
+          <w:color w:val="8496B0" w:themeColor="text2" w:themeTint="99"/>
+        </w:rPr>
+      </w:pPr>
       <w:r>
         <w:rPr>
           <w:i/>
           <w:color w:val="8496B0" w:themeColor="text2" w:themeTint="99"/>
         </w:rPr>
-        <w:t xml:space="preserve"> </w:t>
+        <w:t>Email Id</w:t>
       </w:r>
-      <w:sdt>
-        <w:sdtPr>
-          <w:rPr>
-            <w:i/>
-            <w:color w:val="8496B0" w:themeColor="text2" w:themeTint="99"/>
-          </w:rPr>
-          <w:alias w:val="Field"/>
-          <w:tag w:val="16454088-790400254"/>
-          <w:id w:val="790400254"/>
-          <w:placeholder>
-            <w:docPart w:val="21FE19E404D54D2D82539C79F842A064"/>
-          </w:placeholder>
-        </w:sdtPr>
-        <w:sdtContent>
-          <w:r>
-            <w:t>Address.Country</w:t>
-          </w:r>
-        </w:sdtContent>
-      </w:sdt>
       <w:r>
         <w:rPr>
           <w:i/>
           <w:color w:val="8496B0" w:themeColor="text2" w:themeTint="99"/>
         </w:rPr>
-        <w:t xml:space="preserve"> </w:t>
+        <w:t>:</w:t>
       </w:r>
-      <w:sdt>
-        <w:sdtPr>
-          <w:rPr>
-            <w:i/>
-            <w:color w:val="8496B0" w:themeColor="text2" w:themeTint="99"/>
-          </w:rPr>
-          <w:alias w:val="Field"/>
-          <w:tag w:val="16454088-1307203289"/>
-          <w:id w:val="1307203289"/>
-          <w:placeholder>
-            <w:docPart w:val="DC6EB7151CB047208A5D93F754E82774"/>
-          </w:placeholder>
-        </w:sdtPr>
-        <w:sdtContent>
-          <w:r>
-            <w:t>Address.PostalCode</w:t>
-          </w:r>
-        </w:sdtContent>
-      </w:sdt>
+      <w:r>
+        <w:rPr>
+          <w:i/>
+          <w:color w:val="8496B0" w:themeColor="text2" w:themeTint="99"/>
+        </w:rPr>
+        <w:tab/>
+      </w:r>
+    </w:p>
+    <w:p>
+      <w:pPr>
+        <w:rPr>
+          <w:i/>
+          <w:color w:val="8496B0" w:themeColor="text2" w:themeTint="99"/>
+        </w:rPr>
+      </w:pPr>
+      <w:r>
+        <w:rPr>
+          <w:i/>
+          <w:color w:val="8496B0" w:themeColor="text2" w:themeTint="99"/>
+        </w:rPr>
+        <w:t xml:space="preserve">Mobile: </w:t>
+      </w:r>
+      <w:r>
+        <w:rPr>
+          <w:i/>
+          <w:color w:val="8496B0" w:themeColor="text2" w:themeTint="99"/>
+        </w:rPr>
+        <w:tab/>
+      </w:r>
+    </w:p>
+    <w:p>
+      <w:r>
+        <w:rPr>
+          <w:i/>
+          <w:color w:val="8496B0" w:themeColor="text2" w:themeTint="99"/>
+        </w:rPr>
+        <w:t>Here we go.....</w:t>
+      </w:r>
     </w:p>
     <w:p/>
     <w:sectPr>
@@ -889,7 +841,7 @@
   <w:docParts>
     <w:docPart>
       <w:docPartPr>
-        <w:name w:val="CAB76825514442AE8CAD695F4CDBA07F"/>
+        <w:name w:val="65D9583859CE414BAFD061FB6AD09BE6"/>
         <w:category>
           <w:name w:val="General"/>
           <w:gallery w:val="placeholder"/>
@@ -900,7 +852,7 @@
         <w:behaviors>
           <w:behavior w:val="content"/>
         </w:behaviors>
-        <w:guid w:val="{60415B79-DE65-48AD-95BF-9AC9185E7512}"/>
+        <w:guid w:val="{1D2BB4BE-B08F-41C3-A985-6C32E6F5EA0A}"/>
       </w:docPartPr>
       <w:docPartBody>
         <w:p>
@@ -915,7 +867,7 @@
     </w:docPart>
     <w:docPart>
       <w:docPartPr>
-        <w:name w:val="11EA66DB2AE54291AEBAEFCEAC8986CF"/>
+        <w:name w:val="39EE4219BE044366AF4FDC43DFF79370"/>
         <w:category>
           <w:name w:val="General"/>
           <w:gallery w:val="placeholder"/>
@@ -926,137 +878,7 @@
         <w:behaviors>
           <w:behavior w:val="content"/>
         </w:behaviors>
-        <w:guid w:val="{B93C8BEF-BA7D-4BF7-A265-53179728DEC7}"/>
-      </w:docPartPr>
-      <w:docPartBody>
-        <w:p>
-          <w:r>
-            <w:rPr>
-              <w:rStyle w:val="PlaceholderText"/>
-            </w:rPr>
-            <w:t>Empty</w:t>
-          </w:r>
-        </w:p>
-      </w:docPartBody>
-    </w:docPart>
-    <w:docPart>
-      <w:docPartPr>
-        <w:name w:val="1DBCA0768CB8473A828D4205C3E18BB4"/>
-        <w:category>
-          <w:name w:val="General"/>
-          <w:gallery w:val="placeholder"/>
-        </w:category>
-        <w:types>
-          <w:type w:val="bbPlcHdr"/>
-        </w:types>
-        <w:behaviors>
-          <w:behavior w:val="content"/>
-        </w:behaviors>
-        <w:guid w:val="{F246D571-6B55-435C-9B08-17BDFB6CE597}"/>
-      </w:docPartPr>
-      <w:docPartBody>
-        <w:p>
-          <w:r>
-            <w:rPr>
-              <w:rStyle w:val="PlaceholderText"/>
-            </w:rPr>
-            <w:t>Empty</w:t>
-          </w:r>
-        </w:p>
-      </w:docPartBody>
-    </w:docPart>
-    <w:docPart>
-      <w:docPartPr>
-        <w:name w:val="DE375C397BE346C69177E1021D30C88C"/>
-        <w:category>
-          <w:name w:val="General"/>
-          <w:gallery w:val="placeholder"/>
-        </w:category>
-        <w:types>
-          <w:type w:val="bbPlcHdr"/>
-        </w:types>
-        <w:behaviors>
-          <w:behavior w:val="content"/>
-        </w:behaviors>
-        <w:guid w:val="{EABF265F-9968-4D1E-840D-E2E3ED77BBE6}"/>
-      </w:docPartPr>
-      <w:docPartBody>
-        <w:p>
-          <w:r>
-            <w:rPr>
-              <w:rStyle w:val="PlaceholderText"/>
-            </w:rPr>
-            <w:t>Empty</w:t>
-          </w:r>
-        </w:p>
-      </w:docPartBody>
-    </w:docPart>
-    <w:docPart>
-      <w:docPartPr>
-        <w:name w:val="BB08268CAA024315981A2A27204943BD"/>
-        <w:category>
-          <w:name w:val="General"/>
-          <w:gallery w:val="placeholder"/>
-        </w:category>
-        <w:types>
-          <w:type w:val="bbPlcHdr"/>
-        </w:types>
-        <w:behaviors>
-          <w:behavior w:val="content"/>
-        </w:behaviors>
-        <w:guid w:val="{12E52B75-00BA-4B01-AA76-A26E273DDC1E}"/>
-      </w:docPartPr>
-      <w:docPartBody>
-        <w:p>
-          <w:r>
-            <w:rPr>
-              <w:rStyle w:val="PlaceholderText"/>
-            </w:rPr>
-            <w:t>Empty</w:t>
-          </w:r>
-        </w:p>
-      </w:docPartBody>
-    </w:docPart>
-    <w:docPart>
-      <w:docPartPr>
-        <w:name w:val="21FE19E404D54D2D82539C79F842A064"/>
-        <w:category>
-          <w:name w:val="General"/>
-          <w:gallery w:val="placeholder"/>
-        </w:category>
-        <w:types>
-          <w:type w:val="bbPlcHdr"/>
-        </w:types>
-        <w:behaviors>
-          <w:behavior w:val="content"/>
-        </w:behaviors>
-        <w:guid w:val="{0CB0DB50-F72B-4449-8590-06EA71C5BC52}"/>
-      </w:docPartPr>
-      <w:docPartBody>
-        <w:p>
-          <w:r>
-            <w:rPr>
-              <w:rStyle w:val="PlaceholderText"/>
-            </w:rPr>
-            <w:t>Empty</w:t>
-          </w:r>
-        </w:p>
-      </w:docPartBody>
-    </w:docPart>
-    <w:docPart>
-      <w:docPartPr>
-        <w:name w:val="DC6EB7151CB047208A5D93F754E82774"/>
-        <w:category>
-          <w:name w:val="General"/>
-          <w:gallery w:val="placeholder"/>
-        </w:category>
-        <w:types>
-          <w:type w:val="bbPlcHdr"/>
-        </w:types>
-        <w:behaviors>
-          <w:behavior w:val="content"/>
-        </w:behaviors>
-        <w:guid w:val="{019AB3C8-FF66-41A1-A513-8546AA9E9168}"/>
+        <w:guid w:val="{2596AED0-E741-403F-821E-2691B7A52732}"/>
       </w:docPartPr>
       <w:docPartBody>
         <w:p>
@@ -1080,7 +902,7 @@
     <w:charset w:val="00"/>
     <w:family w:val="swiss"/>
     <w:pitch w:val="variable"/>
-    <w:sig w:usb0="E4002EFF" w:usb1="C000247B" w:usb2="00000009" w:usb3="00000000" w:csb0="000001FF" w:csb1="00000000"/>
+    <w:sig w:usb0="E4002EFF" w:usb1="C200247B" w:usb2="00000009" w:usb3="00000000" w:csb0="000001FF" w:csb1="00000000"/>
   </w:font>
   <w:font w:name="DengXian">
     <w:altName w:val="等线"/>
@@ -1089,6 +911,13 @@
     <w:family w:val="auto"/>
     <w:pitch w:val="variable"/>
     <w:sig w:usb0="A00002BF" w:usb1="38CF7CFA" w:usb2="00000016" w:usb3="00000000" w:csb0="0004000F" w:csb1="00000000"/>
+  </w:font>
+  <w:font w:name="Mangal">
+    <w:panose1 w:val="00000400000000000000"/>
+    <w:charset w:val="00"/>
+    <w:family w:val="roman"/>
+    <w:pitch w:val="variable"/>
+    <w:sig w:usb0="00008003" w:usb1="00000000" w:usb2="00000000" w:usb3="00000000" w:csb0="00000001" w:csb1="00000000"/>
   </w:font>
   <w:font w:name="Times New Roman">
     <w:panose1 w:val="02020603050405020304"/>
@@ -1099,6 +928,7 @@
   </w:font>
   <w:font w:name="DengXian Light">
     <w:altName w:val="等线 Light"/>
+    <w:panose1 w:val="02010600030101010101"/>
     <w:charset w:val="86"/>
     <w:family w:val="auto"/>
     <w:pitch w:val="variable"/>
@@ -1109,7 +939,7 @@
     <w:charset w:val="00"/>
     <w:family w:val="swiss"/>
     <w:pitch w:val="variable"/>
-    <w:sig w:usb0="E4002EFF" w:usb1="C000247B" w:usb2="00000009" w:usb3="00000000" w:csb0="000001FF" w:csb1="00000000"/>
+    <w:sig w:usb0="E4002EFF" w:usb1="C200247B" w:usb2="00000009" w:usb3="00000000" w:csb0="000001FF" w:csb1="00000000"/>
   </w:font>
 </w:fonts>
 </file>
@@ -1130,19 +960,47 @@
   </w:compat>
   <w:rsids>
     <w:rsidRoot w:val="007E1C54"/>
+    <w:rsid w:val="000760CF"/>
+    <w:rsid w:val="000C3BFB"/>
+    <w:rsid w:val="000F6E68"/>
+    <w:rsid w:val="002C390F"/>
     <w:rsid w:val="002F6270"/>
+    <w:rsid w:val="0046412A"/>
+    <w:rsid w:val="004D6952"/>
+    <w:rsid w:val="005B6795"/>
+    <w:rsid w:val="0061143D"/>
+    <w:rsid w:val="0069202A"/>
     <w:rsid w:val="006A155A"/>
+    <w:rsid w:val="006A693F"/>
+    <w:rsid w:val="00705D4A"/>
     <w:rsid w:val="007202C2"/>
+    <w:rsid w:val="0075636C"/>
     <w:rsid w:val="007E1C54"/>
     <w:rsid w:val="00855490"/>
+    <w:rsid w:val="009A0B0B"/>
+    <w:rsid w:val="009B1B16"/>
     <w:rsid w:val="009D0E9C"/>
     <w:rsid w:val="009D4FCB"/>
+    <w:rsid w:val="00A27243"/>
     <w:rsid w:val="00A3217E"/>
+    <w:rsid w:val="00A631BA"/>
     <w:rsid w:val="00AB2A7E"/>
     <w:rsid w:val="00AD492A"/>
+    <w:rsid w:val="00B16B67"/>
+    <w:rsid w:val="00BB48E0"/>
     <w:rsid w:val="00C0517C"/>
+    <w:rsid w:val="00C45D1C"/>
+    <w:rsid w:val="00C66DA0"/>
+    <w:rsid w:val="00D30389"/>
+    <w:rsid w:val="00D409F5"/>
+    <w:rsid w:val="00DF140C"/>
+    <w:rsid w:val="00E04A75"/>
     <w:rsid w:val="00E21A47"/>
     <w:rsid w:val="00EF754E"/>
+    <w:rsid w:val="00F74653"/>
+    <w:rsid w:val="00FB0E75"/>
+    <w:rsid w:val="00FC3F86"/>
+    <w:rsid w:val="00FE7D08"/>
   </w:rsids>
   <m:mathPr>
     <m:mathFont m:val="Cambria Math"/>
@@ -1157,7 +1015,7 @@
     <m:intLim m:val="subSup"/>
     <m:naryLim m:val="undOvr"/>
   </m:mathPr>
-  <w:themeFontLang w:val="en-US" w:eastAsia="zh-CN"/>
+  <w:themeFontLang w:val="en-US" w:eastAsia="zh-CN" w:bidi="hi-IN"/>
   <w:clrSchemeMapping w:bg1="light1" w:t1="dark1" w:bg2="light2" w:t2="dark2" w:accent1="accent1" w:accent2="accent2" w:accent3="accent3" w:accent4="accent4" w:accent5="accent5" w:accent6="accent6" w:hyperlink="hyperlink" w:followedHyperlink="followedHyperlink"/>
   <w:decimalSymbol w:val="."/>
   <w:listSeparator w:val=","/>
@@ -1596,26 +1454,10 @@
     <w:basedOn w:val="DefaultParagraphFont"/>
     <w:uiPriority w:val="99"/>
     <w:semiHidden/>
-    <w:rsid w:val="00A3217E"/>
+    <w:rsid w:val="005B6795"/>
     <w:rPr>
       <w:color w:val="808080"/>
     </w:rPr>
-  </w:style>
-  <w:style w:type="paragraph" w:customStyle="1" w:styleId="503DEFA357C142A9953E1210BF41C1EC">
-    <w:name w:val="503DEFA357C142A9953E1210BF41C1EC"/>
-    <w:rsid w:val="007E1C54"/>
-  </w:style>
-  <w:style w:type="paragraph" w:customStyle="1" w:styleId="F6EA0355847D4E9C852924E1D515B8A9">
-    <w:name w:val="F6EA0355847D4E9C852924E1D515B8A9"/>
-    <w:rsid w:val="007E1C54"/>
-  </w:style>
-  <w:style w:type="paragraph" w:customStyle="1" w:styleId="09BB324BD6B94F78A9368EA01191DF8A">
-    <w:name w:val="09BB324BD6B94F78A9368EA01191DF8A"/>
-    <w:rsid w:val="00A3217E"/>
-  </w:style>
-  <w:style w:type="paragraph" w:customStyle="1" w:styleId="54EDFEFD084C438AB0095E1AE57CB779">
-    <w:name w:val="54EDFEFD084C438AB0095E1AE57CB779"/>
-    <w:rsid w:val="00A3217E"/>
   </w:style>
 </w:styles>
 </file>
@@ -1923,10 +1765,10 @@
 </file>
 
 <file path=customXml/item1.xml><?xml version="1.0" encoding="utf-8"?>
-<ProjectData xmlns="http://Docentric.org/ProjectData.xml" ProductId="0" ProductVersion="6.1.37.1661">
+<ProjectData xmlns="http://Docentric.org/ProjectData.xml" ProductId="0" ProductVersion="6.0.40.1513">
   <UISettings xmlns="" ELEMENT_APPEAREANCE_TYPE="1">
-    <ElementsPane IsVisible="1" DockPosition="2" Width="389" Height="1071"/>
-    <DataSourcesPane IsVisible="1" DockPosition="2" Width="586" Height="1071"/>
+    <ElementsPane IsVisible="1" DockPosition="2" Width="701" Height="1061"/>
+    <DataSourcesPane IsVisible="1" DockPosition="2" Width="563" Height="1061"/>
   </UISettings>
   <DataSources xmlns="">
     <DataSource IsDefault="1" DataKind="1">
@@ -2126,232 +1968,20 @@
         </Types>
       </Schema>
     </DataSource>
-    <DataSource Name="FirstDataSource" IsDefault="0" DataKind="1">
-      <Schema TypeId="1" CollectionTypeId="26" TypeAssemblyPath="FirstTrial.Models\bin\Debug\netstandard2.0\FirstTrial.Models.dll" TypeAssemblyFullName="FirstTrial.Models, Version=1.0.0.0, Culture=neutral, PublicKeyToken=null" TypeAssemblyName="FirstTrial.Models" MakeItList="0">
-        <Types>
-          <Type Id="1" Kind="1" Name="Customer" FullName="FirstTrial.Models.Customer" Namespace="FirstTrial.Models" AssemblyFullName="FirstTrial.Models, Version=1.0.0.0, Culture=neutral, PublicKeyToken=null" IsSimpleType="0" IsCollection="0" CollectionItemType="0">
-            <Members>
-              <Member Name="Id" Type="2" Kind="1"/>
-              <Member Name="Company" Type="3" Kind="1"/>
-              <Member Name="LastName" Type="3" Kind="1"/>
-              <Member Name="FirstName" Type="3" Kind="1"/>
-              <Member Name="EmailAddress" Type="3" Kind="1"/>
-              <Member Name="JobTitle" Type="3" Kind="1"/>
-              <Member Name="BusinessPhone" Type="3" Kind="1"/>
-              <Member Name="HomePhone" Type="3" Kind="1"/>
-              <Member Name="MobilePhone" Type="3" Kind="1"/>
-              <Member Name="FaxNumber" Type="3" Kind="1"/>
-              <Member Name="Address" Type="6" Kind="1"/>
-              <Member Name="Orders" Type="7" Kind="1"/>
-            </Members>
-          </Type>
-          <Type Id="2" Kind="2" Name="Int64" FullName="System.Int64" Namespace="System" AssemblyFullName="mscorlib, Version=4.0.0.0, Culture=neutral, PublicKeyToken=b77a5c561934e089" IsSimpleType="1" IsCollection="0" CollectionItemType="0">
-            <Members/>
-          </Type>
-          <Type Id="3" Kind="1" Name="String" FullName="System.String" Namespace="System" AssemblyFullName="mscorlib, Version=4.0.0.0, Culture=neutral, PublicKeyToken=b77a5c561934e089" IsSimpleType="1" IsCollection="1" CollectionItemType="4">
-            <Members>
-              <Member Name="Chars" Type="4" Kind="1"/>
-              <Member Name="Length" Type="5" Kind="1"/>
-            </Members>
-          </Type>
-          <Type Id="4" Kind="2" Name="Char" FullName="System.Char" Namespace="System" AssemblyFullName="mscorlib, Version=4.0.0.0, Culture=neutral, PublicKeyToken=b77a5c561934e089" IsSimpleType="0" IsCollection="0" CollectionItemType="0">
-            <Members/>
-          </Type>
-          <Type Id="5" Kind="2" Name="Int32" FullName="System.Int32" Namespace="System" AssemblyFullName="mscorlib, Version=4.0.0.0, Culture=neutral, PublicKeyToken=b77a5c561934e089" IsSimpleType="1" IsCollection="0" CollectionItemType="0">
-            <Members/>
-          </Type>
-          <Type Id="6" Kind="1" Name="Address" FullName="FirstTrial.Models.Address" Namespace="FirstTrial.Models" AssemblyFullName="FirstTrial.Models, Version=1.0.0.0, Culture=neutral, PublicKeyToken=null" IsSimpleType="0" IsCollection="0" CollectionItemType="0">
-            <Members>
-              <Member Name="StreetNumber" Type="3" Kind="1"/>
-              <Member Name="City" Type="3" Kind="1"/>
-              <Member Name="Province" Type="3" Kind="1"/>
-              <Member Name="PostalCode" Type="3" Kind="1"/>
-              <Member Name="Country" Type="3" Kind="1"/>
-            </Members>
-          </Type>
-          <Type Id="7" Kind="1" Name="List`1" FullName="System.Collections.Generic.List`1[[FirstTrial.Models.Order, FirstTrial.Models, Version=1.0.0.0, Culture=neutral, PublicKeyToken=null]]" Namespace="System.Collections.Generic" AssemblyFullName="mscorlib, Version=4.0.0.0, Culture=neutral, PublicKeyToken=b77a5c561934e089" IsSimpleType="0" IsCollection="1" CollectionItemType="8">
-            <Members>
-              <Member Name="Capacity" Type="5" Kind="1"/>
-              <Member Name="Count" Type="5" Kind="1"/>
-            </Members>
-          </Type>
-          <Type Id="8" Kind="1" Name="Order" FullName="FirstTrial.Models.Order" Namespace="FirstTrial.Models" AssemblyFullName="FirstTrial.Models, Version=1.0.0.0, Culture=neutral, PublicKeyToken=null" IsSimpleType="0" IsCollection="0" CollectionItemType="0">
-            <Members>
-              <Member Name="Id" Type="2" Kind="1"/>
-              <Member Name="OrderDate" Type="9" Kind="1"/>
-              <Member Name="ShippedDate" Type="14" Kind="1"/>
-              <Member Name="ShipName" Type="3" Kind="1"/>
-              <Member Name="ShipAddress" Type="6" Kind="1"/>
-              <Member Name="ShippingFee" Type="16" Kind="1"/>
-              <Member Name="Taxes" Type="16" Kind="1"/>
-              <Member Name="PaymentType" Type="3" Kind="1"/>
-              <Member Name="PaidDate" Type="14" Kind="1"/>
-              <Member Name="Notes" Type="3" Kind="1"/>
-              <Member Name="TaxRate" Type="16" Kind="1"/>
-              <Member Name="Status" Type="17" Kind="1"/>
-              <Member Name="Customer" Type="1" Kind="1"/>
-              <Member Name="OrderDetails" Type="18" Kind="1"/>
-            </Members>
-          </Type>
-          <Type Id="9" Kind="2" Name="DateTime" FullName="System.DateTime" Namespace="System" AssemblyFullName="mscorlib, Version=4.0.0.0, Culture=neutral, PublicKeyToken=b77a5c561934e089" IsSimpleType="1" IsCollection="0" CollectionItemType="0">
-            <Members>
-              <Member Name="Date" Type="9" Kind="1"/>
-              <Member Name="Day" Type="5" Kind="1"/>
-              <Member Name="DayOfWeek" Type="10" Kind="1"/>
-              <Member Name="DayOfYear" Type="5" Kind="1"/>
-              <Member Name="Hour" Type="5" Kind="1"/>
-              <Member Name="Kind" Type="11" Kind="1"/>
-              <Member Name="Millisecond" Type="5" Kind="1"/>
-              <Member Name="Minute" Type="5" Kind="1"/>
-              <Member Name="Month" Type="5" Kind="1"/>
-              <Member Name="Second" Type="5" Kind="1"/>
-              <Member Name="Ticks" Type="2" Kind="1"/>
-              <Member Name="TimeOfDay" Type="12" Kind="1"/>
-              <Member Name="Year" Type="5" Kind="1"/>
-            </Members>
-          </Type>
-          <Type Id="10" Kind="5" Name="DayOfWeek" FullName="System.DayOfWeek" Namespace="System" AssemblyFullName="mscorlib, Version=4.0.0.0, Culture=neutral, PublicKeyToken=b77a5c561934e089" IsSimpleType="0" IsCollection="0" CollectionItemType="0">
-            <Members>
-              <Member Name="value__" Type="5" Kind="2"/>
-            </Members>
-          </Type>
-          <Type Id="11" Kind="5" Name="DateTimeKind" FullName="System.DateTimeKind" Namespace="System" AssemblyFullName="mscorlib, Version=4.0.0.0, Culture=neutral, PublicKeyToken=b77a5c561934e089" IsSimpleType="0" IsCollection="0" CollectionItemType="0">
-            <Members>
-              <Member Name="value__" Type="5" Kind="2"/>
-            </Members>
-          </Type>
-          <Type Id="12" Kind="2" Name="TimeSpan" FullName="System.TimeSpan" Namespace="System" AssemblyFullName="mscorlib, Version=4.0.0.0, Culture=neutral, PublicKeyToken=b77a5c561934e089" IsSimpleType="0" IsCollection="0" CollectionItemType="0">
-            <Members>
-              <Member Name="Ticks" Type="2" Kind="1"/>
-              <Member Name="Days" Type="5" Kind="1"/>
-              <Member Name="Hours" Type="5" Kind="1"/>
-              <Member Name="Milliseconds" Type="5" Kind="1"/>
-              <Member Name="Minutes" Type="5" Kind="1"/>
-              <Member Name="Seconds" Type="5" Kind="1"/>
-              <Member Name="TotalDays" Type="13" Kind="1"/>
-              <Member Name="TotalHours" Type="13" Kind="1"/>
-              <Member Name="TotalMilliseconds" Type="13" Kind="1"/>
-              <Member Name="TotalMinutes" Type="13" Kind="1"/>
-              <Member Name="TotalSeconds" Type="13" Kind="1"/>
-            </Members>
-          </Type>
-          <Type Id="13" Kind="2" Name="Double" FullName="System.Double" Namespace="System" AssemblyFullName="mscorlib, Version=4.0.0.0, Culture=neutral, PublicKeyToken=b77a5c561934e089" IsSimpleType="1" IsCollection="0" CollectionItemType="0">
-            <Members/>
-          </Type>
-          <Type Id="14" Kind="2" Name="Nullable`1" FullName="System.Nullable`1[[System.DateTime, mscorlib, Version=4.0.0.0, Culture=neutral, PublicKeyToken=b77a5c561934e089]]" Namespace="System" AssemblyFullName="mscorlib, Version=4.0.0.0, Culture=neutral, PublicKeyToken=b77a5c561934e089" IsSimpleType="1" IsCollection="0" CollectionItemType="0">
-            <Members>
-              <Member Name="HasValue" Type="15" Kind="1"/>
-              <Member Name="Value" Type="9" Kind="1"/>
-            </Members>
-          </Type>
-          <Type Id="15" Kind="2" Name="Boolean" FullName="System.Boolean" Namespace="System" AssemblyFullName="mscorlib, Version=4.0.0.0, Culture=neutral, PublicKeyToken=b77a5c561934e089" IsSimpleType="1" IsCollection="0" CollectionItemType="0">
-            <Members/>
-          </Type>
-          <Type Id="16" Kind="2" Name="Decimal" FullName="System.Decimal" Namespace="System" AssemblyFullName="mscorlib, Version=4.0.0.0, Culture=neutral, PublicKeyToken=b77a5c561934e089" IsSimpleType="1" IsCollection="0" CollectionItemType="0">
-            <Members/>
-          </Type>
-          <Type Id="17" Kind="5" Name="OrderStatus" FullName="FirstTrial.Models.OrderStatus" Namespace="FirstTrial.Models" AssemblyFullName="FirstTrial.Models, Version=1.0.0.0, Culture=neutral, PublicKeyToken=null" IsSimpleType="0" IsCollection="0" CollectionItemType="0">
-            <Members>
-              <Member Name="value__" Type="5" Kind="2"/>
-            </Members>
-          </Type>
-          <Type Id="18" Kind="1" Name="List`1" FullName="System.Collections.Generic.List`1[[FirstTrial.Models.OrderDetail, FirstTrial.Models, Version=1.0.0.0, Culture=neutral, PublicKeyToken=null]]" Namespace="System.Collections.Generic" AssemblyFullName="mscorlib, Version=4.0.0.0, Culture=neutral, PublicKeyToken=b77a5c561934e089" IsSimpleType="0" IsCollection="1" CollectionItemType="19">
-            <Members>
-              <Member Name="Capacity" Type="5" Kind="1"/>
-              <Member Name="Count" Type="5" Kind="1"/>
-            </Members>
-          </Type>
-          <Type Id="19" Kind="1" Name="OrderDetail" FullName="FirstTrial.Models.OrderDetail" Namespace="FirstTrial.Models" AssemblyFullName="FirstTrial.Models, Version=1.0.0.0, Culture=neutral, PublicKeyToken=null" IsSimpleType="0" IsCollection="0" CollectionItemType="0">
-            <Members>
-              <Member Name="Id" Type="2" Kind="1"/>
-              <Member Name="Quantity" Type="16" Kind="1"/>
-              <Member Name="UnitPrice" Type="16" Kind="1"/>
-              <Member Name="Discount" Type="13" Kind="1"/>
-              <Member Name="DateAllocated" Type="9" Kind="1"/>
-              <Member Name="TotalPrice" Type="16" Kind="1"/>
-              <Member Name="Order" Type="8" Kind="1"/>
-              <Member Name="Product" Type="20" Kind="1"/>
-            </Members>
-          </Type>
-          <Type Id="20" Kind="1" Name="Product" FullName="FirstTrial.Models.Product" Namespace="FirstTrial.Models" AssemblyFullName="FirstTrial.Models, Version=1.0.0.0, Culture=neutral, PublicKeyToken=null" IsSimpleType="0" IsCollection="0" CollectionItemType="0">
-            <Members>
-              <Member Name="Id" Type="2" Kind="1"/>
-              <Member Name="Code" Type="3" Kind="1"/>
-              <Member Name="Name" Type="3" Kind="1"/>
-              <Member Name="Price" Type="16" Kind="1"/>
-              <Member Name="Discontinued" Type="15" Kind="1"/>
-              <Member Name="Image" Type="21" Kind="1"/>
-              <Member Name="Description" Type="3" Kind="1"/>
-              <Member Name="Category" Type="24" Kind="1"/>
-              <Member Name="OrderDetails" Type="18" Kind="1"/>
-            </Members>
-          </Type>
-          <Type Id="21" Kind="1" Name="Byte[]" FullName="System.Byte[]" Namespace="System" AssemblyFullName="mscorlib, Version=4.0.0.0, Culture=neutral, PublicKeyToken=b77a5c561934e089" IsSimpleType="0" IsCollection="1" CollectionItemType="22">
-            <Members>
-              <Member Name="Length" Type="5" Kind="1"/>
-              <Member Name="LongLength" Type="2" Kind="1"/>
-              <Member Name="Rank" Type="5" Kind="1"/>
-              <Member Name="SyncRoot" Type="23" Kind="1"/>
-              <Member Name="IsReadOnly" Type="15" Kind="1"/>
-              <Member Name="IsFixedSize" Type="15" Kind="1"/>
-              <Member Name="IsSynchronized" Type="15" Kind="1"/>
-            </Members>
-          </Type>
-          <Type Id="22" Kind="2" Name="Byte" FullName="System.Byte" Namespace="System" AssemblyFullName="mscorlib, Version=4.0.0.0, Culture=neutral, PublicKeyToken=b77a5c561934e089" IsSimpleType="1" IsCollection="0" CollectionItemType="0">
-            <Members/>
-          </Type>
-          <Type Id="23" Kind="1" Name="Object" FullName="System.Object" Namespace="System" AssemblyFullName="mscorlib, Version=4.0.0.0, Culture=neutral, PublicKeyToken=b77a5c561934e089" IsSimpleType="0" IsCollection="0" CollectionItemType="0">
-            <Members/>
-          </Type>
-          <Type Id="24" Kind="1" Name="ProductCategory" FullName="FirstTrial.Models.ProductCategory" Namespace="FirstTrial.Models" AssemblyFullName="FirstTrial.Models, Version=1.0.0.0, Culture=neutral, PublicKeyToken=null" IsSimpleType="0" IsCollection="0" CollectionItemType="0">
-            <Members>
-              <Member Name="Id" Type="2" Kind="1"/>
-              <Member Name="Name" Type="3" Kind="1"/>
-              <Member Name="ProductCount" Type="5" Kind="1"/>
-              <Member Name="Products" Type="25" Kind="1"/>
-            </Members>
-          </Type>
-          <Type Id="25" Kind="1" Name="List`1" FullName="System.Collections.Generic.List`1[[FirstTrial.Models.Product, FirstTrial.Models, Version=1.0.0.0, Culture=neutral, PublicKeyToken=null]]" Namespace="System.Collections.Generic" AssemblyFullName="mscorlib, Version=4.0.0.0, Culture=neutral, PublicKeyToken=b77a5c561934e089" IsSimpleType="0" IsCollection="1" CollectionItemType="20">
-            <Members>
-              <Member Name="Capacity" Type="5" Kind="1"/>
-              <Member Name="Count" Type="5" Kind="1"/>
-            </Members>
-          </Type>
-          <Type Id="26" Kind="1" Name="IEnumerable&lt;Customer&gt;" FullName="System.Collections.Generic.IEnumerable&lt;FirstTrial.Models.Customer&gt;" IsSimpleType="0" IsCollection="1" CollectionItemType="1">
-            <Members/>
-          </Type>
-        </Types>
-      </Schema>
-    </DataSource>
   </DataSources>
   <Elements xmlns="">
-    <Element Type="Field" Id="2562971386">
+    <Element Type="Field" Id="853157254">
       <ValueBinding DataKind="1" Source="(default)" Path="FirstName"/>
     </Element>
-    <Element Type="Field" Id="342299060">
+    <Element Type="Field" Id="3640362556">
       <ValueBinding DataKind="1" Source="(default)" Path="LastName"/>
-    </Element>
-    <Element Type="Field" Id="1049892066">
-      <ValueBinding DataKind="1" Source="(default)" Path="JobTitle"/>
-    </Element>
-    <Element Type="Field" Id="941498451">
-      <ValueBinding DataKind="1" Source="(default)" Path="Company"/>
-    </Element>
-    <Element Type="Field" Id="2830247393">
-      <ValueBinding DataKind="1" Source="(default)" Path="Address.City"/>
-    </Element>
-    <Element Type="Field" Id="790400254">
-      <ValueBinding DataKind="1" Source="(default)" Path="Address.Country"/>
-    </Element>
-    <Element Type="Field" Id="1307203289">
-      <ValueBinding DataKind="1" Source="(default)" Path="Address.PostalCode"/>
     </Element>
   </Elements>
 </ProjectData>
 </file>
 
 <file path=customXml/itemProps1.xml><?xml version="1.0" encoding="utf-8"?>
-<ds:datastoreItem xmlns:ds="http://schemas.openxmlformats.org/officeDocument/2006/customXml" ds:itemID="{076780C4-DD9B-4F24-B0B6-6F04BF32DB5D}">
+<ds:datastoreItem xmlns:ds="http://schemas.openxmlformats.org/officeDocument/2006/customXml" ds:itemID="{8E42A532-7D41-47BA-9112-6FEBE6BBFB0F}">
   <ds:schemaRefs>
     <ds:schemaRef ds:uri="http://Docentric.org/ProjectData.xml"/>
     <ds:schemaRef ds:uri=""/>

</xml_diff>